<commit_message>
Use nlmixr2rpt 0.2.3 defaults and embed the updated video
nlmixr2rpt 0.2.3 (GitHub, heading to CRAN) now opens its default
Word and PowerPoint reports with the model diagram and the
gen_eqn_table() equations, so the post's custom configuration,
helper function and equatags caveat are gone: make-report.R just
calls report_fit(), and model-additions.yaml is removed. The reports
and Word preview are rebuilt against it.

Deck: the two nlmixr2rpt slides become one, with a new narrated take.
tts_generate.py: fix an off-by-one that kept the final slide's words
from being matched, which put "Thank you" at the end of the previous
clip.

Embed the updated video (https://youtu.be/Jf9QbmuR_Xw) and update the
announcement text to match.
</commit_message>
<xml_diff>
--- a/content/blog/2026-09-29-model-diagrams-equations/nlmixr2rpt/fit-report.docx
+++ b/content/blog/2026-09-29-model-diagrams-equations/nlmixr2rpt/fit-report.docx
@@ -8,7 +8,7 @@
         <w:pStyle w:val="Heading1"/>
       </w:pPr>
       <w:r>
-        <w:t xml:space="preserve">Model</w:t>
+        <w:t xml:space="preserve">Model Structure</w:t>
       </w:r>
     </w:p>
     <w:p>
@@ -67,7 +67,7 @@
         </w:rPr>
         <w:t xml:space="preserve">Figure </w:t>
       </w:r>
-      <w:bookmarkStart w:id="325fbac9-1be6-4fb2-9e8f-0a4edc722548" w:name="model_diagram"/>
+      <w:bookmarkStart w:id="b2a12086-867f-41ec-9145-b4c7aecebe74" w:name="model_diagram"/>
       <w:r>
         <w:rPr/>
         <w:t xml:space="preserve"/>
@@ -88,7 +88,7 @@
         <w:rPr/>
         <w:t xml:space="preserve"/>
       </w:r>
-      <w:bookmarkEnd w:id="325fbac9-1be6-4fb2-9e8f-0a4edc722548"/>
+      <w:bookmarkEnd w:id="b2a12086-867f-41ec-9145-b4c7aecebe74"/>
       <w:r>
         <w:rPr>
           <w:rFonts/>
@@ -726,7 +726,7 @@
         </w:rPr>
         <w:t xml:space="preserve">Table </w:t>
       </w:r>
-      <w:bookmarkStart w:id="628f97fc-67e7-43a6-be43-7e0fd6f9362e" w:name="model_equations"/>
+      <w:bookmarkStart w:id="3ce444d4-2c54-41ef-9710-2d83d20560e6" w:name="model_equations"/>
       <w:r>
         <w:rPr/>
         <w:t xml:space="preserve"/>
@@ -747,7 +747,7 @@
         <w:rPr/>
         <w:t xml:space="preserve"/>
       </w:r>
-      <w:bookmarkEnd w:id="628f97fc-67e7-43a6-be43-7e0fd6f9362e"/>
+      <w:bookmarkEnd w:id="3ce444d4-2c54-41ef-9710-2d83d20560e6"/>
       <w:r>
         <w:rPr>
           <w:rFonts/>
@@ -2755,7 +2755,7 @@
         </w:rPr>
         <w:t xml:space="preserve">Table </w:t>
       </w:r>
-      <w:bookmarkStart w:id="887dc8a9-39be-426c-92a4-ecd3042969d9" w:name="pest_table"/>
+      <w:bookmarkStart w:id="c98128a3-affa-4697-8483-5481026b07fd" w:name="pest_table"/>
       <w:r>
         <w:rPr/>
         <w:t xml:space="preserve"/>
@@ -2776,7 +2776,7 @@
         <w:rPr/>
         <w:t xml:space="preserve"/>
       </w:r>
-      <w:bookmarkEnd w:id="887dc8a9-39be-426c-92a4-ecd3042969d9"/>
+      <w:bookmarkEnd w:id="c98128a3-affa-4697-8483-5481026b07fd"/>
       <w:r>
         <w:rPr>
           <w:rFonts/>
@@ -2872,7 +2872,7 @@
         </w:rPr>
         <w:t xml:space="preserve">Figure </w:t>
       </w:r>
-      <w:bookmarkStart w:id="5614a5c1-f466-4db3-b089-3bf377d5fe5b" w:name="ind_plots"/>
+      <w:bookmarkStart w:id="98d4fdc2-19b4-456f-8d5d-ac25107e962d" w:name="ind_plots"/>
       <w:r>
         <w:rPr/>
         <w:t xml:space="preserve"/>
@@ -2893,7 +2893,7 @@
         <w:rPr/>
         <w:t xml:space="preserve"/>
       </w:r>
-      <w:bookmarkEnd w:id="5614a5c1-f466-4db3-b089-3bf377d5fe5b"/>
+      <w:bookmarkEnd w:id="98d4fdc2-19b4-456f-8d5d-ac25107e962d"/>
       <w:r>
         <w:rPr>
           <w:rFonts/>
@@ -2975,7 +2975,7 @@
         </w:rPr>
         <w:t xml:space="preserve">Figure </w:t>
       </w:r>
-      <w:bookmarkStart w:id="07f84c1a-5258-4ca8-a4e5-5c7230748845" w:name="dv_vs_pred_ipred"/>
+      <w:bookmarkStart w:id="907883d9-74dc-4230-bd0d-c6ad4acfae50" w:name="dv_vs_pred_ipred"/>
       <w:r>
         <w:rPr/>
         <w:t xml:space="preserve"/>
@@ -2996,7 +2996,7 @@
         <w:rPr/>
         <w:t xml:space="preserve"/>
       </w:r>
-      <w:bookmarkEnd w:id="07f84c1a-5258-4ca8-a4e5-5c7230748845"/>
+      <w:bookmarkEnd w:id="907883d9-74dc-4230-bd0d-c6ad4acfae50"/>
       <w:r>
         <w:rPr>
           <w:rFonts/>
@@ -3074,7 +3074,7 @@
         </w:rPr>
         <w:t xml:space="preserve">Figure </w:t>
       </w:r>
-      <w:bookmarkStart w:id="8ace5aaf-79c6-4b8f-96c3-6cd0b993b1dc" w:name="res_vs_pred_idv"/>
+      <w:bookmarkStart w:id="d7bfa529-2fa9-4168-892f-0d31856eaa76" w:name="res_vs_pred_idv"/>
       <w:r>
         <w:rPr/>
         <w:t xml:space="preserve"/>
@@ -3095,7 +3095,7 @@
         <w:rPr/>
         <w:t xml:space="preserve"/>
       </w:r>
-      <w:bookmarkEnd w:id="8ace5aaf-79c6-4b8f-96c3-6cd0b993b1dc"/>
+      <w:bookmarkEnd w:id="d7bfa529-2fa9-4168-892f-0d31856eaa76"/>
       <w:r>
         <w:rPr>
           <w:rFonts/>
@@ -3177,7 +3177,7 @@
         </w:rPr>
         <w:t xml:space="preserve">Figure </w:t>
       </w:r>
-      <w:bookmarkStart w:id="5bcbf471-5340-47b5-a2e0-8ed02bf4d178" w:name="prm_vs_iteration"/>
+      <w:bookmarkStart w:id="b1af50e5-8ecc-4faa-85f3-bf55e1ecc379" w:name="prm_vs_iteration"/>
       <w:r>
         <w:rPr/>
         <w:t xml:space="preserve"/>
@@ -3198,7 +3198,7 @@
         <w:rPr/>
         <w:t xml:space="preserve"/>
       </w:r>
-      <w:bookmarkEnd w:id="5bcbf471-5340-47b5-a2e0-8ed02bf4d178"/>
+      <w:bookmarkEnd w:id="b1af50e5-8ecc-4faa-85f3-bf55e1ecc379"/>
       <w:r>
         <w:rPr>
           <w:rFonts/>

</xml_diff>